<commit_message>
se mejoro redondeo y modific el n infrome en resol
</commit_message>
<xml_diff>
--- a/interfaz3/semiPlantillaFinal.docx
+++ b/interfaz3/semiPlantillaFinal.docx
@@ -483,7 +483,19 @@
           <w:sz w:val="22"/>
           <w:szCs w:val="22"/>
         </w:rPr>
-        <w:t>{cuadroPedoAmazonia-numeroRegularizacionRRR</w:t>
+        <w:t>{cuadroPedoAmazonia-</w:t>
+      </w:r>
+      <w:proofErr w:type="gramStart"/>
+      <w:r>
+        <w:rPr>
+          <w:rFonts w:ascii="Arial" w:hAnsi="Arial" w:cs="Arial"/>
+          <w:b/>
+          <w:bCs/>
+          <w:color w:val="FF0000"/>
+          <w:sz w:val="22"/>
+          <w:szCs w:val="22"/>
+        </w:rPr>
+        <w:t>numeroRegularizacionRRR</w:t>
       </w:r>
       <w:r>
         <w:rPr>
@@ -504,6 +516,7 @@
         </w:rPr>
         <w:t>{</w:t>
       </w:r>
+      <w:proofErr w:type="gramEnd"/>
       <w:r>
         <w:rPr>
           <w:rFonts w:ascii="Arial" w:hAnsi="Arial" w:cs="Arial"/>
@@ -941,23 +954,6 @@
           <w:szCs w:val="22"/>
         </w:rPr>
         <w:t>}</w:t>
-      </w:r>
-      <w:r>
-        <w:rPr>
-          <w:rFonts w:ascii="Arial" w:hAnsi="Arial" w:cs="Arial"/>
-          <w:sz w:val="22"/>
-          <w:szCs w:val="22"/>
-        </w:rPr>
-        <w:t xml:space="preserve"> e Informe </w:t>
-      </w:r>
-      <w:r>
-        <w:rPr>
-          <w:rFonts w:ascii="Arial" w:hAnsi="Arial" w:cs="Arial"/>
-          <w:sz w:val="22"/>
-          <w:szCs w:val="22"/>
-          <w:highlight w:val="yellow"/>
-        </w:rPr>
-        <w:t>N°0000000000000 de fecha 00.00.00</w:t>
       </w:r>
       <w:r>
         <w:rPr>
@@ -9123,7 +9119,65 @@
           <w:rFonts w:ascii="Arial" w:hAnsi="Arial" w:cs="Arial"/>
           <w:lang w:eastAsia="en-US"/>
         </w:rPr>
-        <w:t xml:space="preserve">Que, de conformidad con el artículo 78° del nuevo Reglamento de Organización y Funciones de la SUNAT - Sección Primera aprobado mediante el Decreto Supremo </w:t>
+        <w:t xml:space="preserve">Que, </w:t>
+      </w:r>
+      <w:r>
+        <w:rPr>
+          <w:rFonts w:ascii="Arial" w:hAnsi="Arial" w:cs="Arial"/>
+          <w:lang w:eastAsia="en-US"/>
+        </w:rPr>
+        <w:t>de acuerdo</w:t>
+      </w:r>
+      <w:r>
+        <w:rPr>
+          <w:rFonts w:ascii="Arial" w:hAnsi="Arial" w:cs="Arial"/>
+          <w:lang w:eastAsia="en-US"/>
+        </w:rPr>
+        <w:t xml:space="preserve"> al</w:t>
+      </w:r>
+      <w:r>
+        <w:rPr>
+          <w:rFonts w:ascii="Arial" w:hAnsi="Arial" w:cs="Arial"/>
+          <w:lang w:eastAsia="en-US"/>
+        </w:rPr>
+        <w:t xml:space="preserve"> Informe N°</w:t>
+      </w:r>
+      <w:r>
+        <w:rPr>
+          <w:rFonts w:ascii="Arial" w:hAnsi="Arial" w:cs="Arial"/>
+          <w:highlight w:val="yellow"/>
+          <w:lang w:eastAsia="en-US"/>
+        </w:rPr>
+        <w:t>000226-2026-SUNAT/3T0500</w:t>
+      </w:r>
+      <w:r>
+        <w:rPr>
+          <w:rFonts w:ascii="Arial" w:hAnsi="Arial" w:cs="Arial"/>
+          <w:lang w:eastAsia="en-US"/>
+        </w:rPr>
+        <w:t xml:space="preserve"> de fecha </w:t>
+      </w:r>
+      <w:r>
+        <w:rPr>
+          <w:rFonts w:ascii="Arial" w:hAnsi="Arial" w:cs="Arial"/>
+          <w:highlight w:val="yellow"/>
+          <w:lang w:eastAsia="en-US"/>
+        </w:rPr>
+        <w:t>25.05.2026</w:t>
+      </w:r>
+      <w:r>
+        <w:rPr>
+          <w:rFonts w:ascii="Arial" w:hAnsi="Arial" w:cs="Arial"/>
+          <w:lang w:eastAsia="en-US"/>
+        </w:rPr>
+        <w:t xml:space="preserve">, cuyos fundamentos se reproduce en la presente resolución, y, </w:t>
+      </w:r>
+      <w:r>
+        <w:rPr>
+          <w:rFonts w:ascii="Arial" w:hAnsi="Arial" w:cs="Arial"/>
+          <w:lang w:eastAsia="en-US"/>
+        </w:rPr>
+        <w:t xml:space="preserve">de conformidad con el artículo 78° del nuevo Reglamento de Organización y Funciones de la SUNAT - Sección Primera aprobado mediante el Decreto Supremo </w:t>
       </w:r>
       <w:r>
         <w:rPr>
@@ -10232,7 +10286,16 @@
           <w:sz w:val="22"/>
           <w:szCs w:val="22"/>
         </w:rPr>
-        <w:t xml:space="preserve"> cargo a la “Sub Cuenta Especial Tesoro Público Ley </w:t>
+        <w:t xml:space="preserve"> cargo a la “Sub </w:t>
+      </w:r>
+      <w:r>
+        <w:rPr>
+          <w:rFonts w:ascii="Arial" w:hAnsi="Arial" w:cs="Arial"/>
+          <w:sz w:val="22"/>
+          <w:szCs w:val="22"/>
+        </w:rPr>
+        <w:lastRenderedPageBreak/>
+        <w:t xml:space="preserve">Cuenta Especial Tesoro Público Ley </w:t>
       </w:r>
       <w:r>
         <w:rPr>
@@ -10264,16 +10327,7 @@
           <w:sz w:val="22"/>
           <w:szCs w:val="22"/>
         </w:rPr>
-        <w:t xml:space="preserve">27037”, por los considerandos expuestos en la </w:t>
-      </w:r>
-      <w:r>
-        <w:rPr>
-          <w:rFonts w:ascii="Arial" w:hAnsi="Arial" w:cs="Arial"/>
-          <w:sz w:val="22"/>
-          <w:szCs w:val="22"/>
-        </w:rPr>
-        <w:lastRenderedPageBreak/>
-        <w:t>presente resolución; sin perjuicio de la fiscalización posterior que pudiera realizar la Superintendencia Nacional de Aduanas y de Administración Tributaria - SUNAT.</w:t>
+        <w:t>27037”, por los considerandos expuestos en la presente resolución; sin perjuicio de la fiscalización posterior que pudiera realizar la Superintendencia Nacional de Aduanas y de Administración Tributaria - SUNAT.</w:t>
       </w:r>
     </w:p>
     <w:p>

</xml_diff>

<commit_message>
se modifico el word con sutilezas
</commit_message>
<xml_diff>
--- a/interfaz3/semiPlantillaFinal.docx
+++ b/interfaz3/semiPlantillaFinal.docx
@@ -6347,6 +6347,14 @@
           <w:rFonts w:ascii="Arial" w:hAnsi="Arial" w:cs="Arial"/>
         </w:rPr>
       </w:pPr>
+    </w:p>
+    <w:p>
+      <w:pPr>
+        <w:spacing w:line="240" w:lineRule="auto"/>
+        <w:rPr>
+          <w:rFonts w:ascii="Arial" w:hAnsi="Arial" w:cs="Arial"/>
+        </w:rPr>
+      </w:pPr>
       <w:r>
         <w:rPr>
           <w:rFonts w:ascii="Arial" w:hAnsi="Arial" w:cs="Arial"/>
@@ -7422,32 +7430,6 @@
           <w:szCs w:val="20"/>
         </w:rPr>
       </w:pPr>
-      <w:r>
-        <w:rPr>
-          <w:rFonts w:ascii="Arial" w:hAnsi="Arial" w:cs="Arial"/>
-          <w:sz w:val="20"/>
-          <w:szCs w:val="20"/>
-        </w:rPr>
-        <w:t>{/</w:t>
-      </w:r>
-      <w:proofErr w:type="spellStart"/>
-      <w:r>
-        <w:rPr>
-          <w:rFonts w:ascii="Arial" w:hAnsi="Arial" w:cs="Arial"/>
-          <w:sz w:val="20"/>
-          <w:szCs w:val="20"/>
-        </w:rPr>
-        <w:t>estadoPECOyAMAZONIA</w:t>
-      </w:r>
-      <w:proofErr w:type="spellEnd"/>
-      <w:r>
-        <w:rPr>
-          <w:rFonts w:ascii="Arial" w:hAnsi="Arial" w:cs="Arial"/>
-          <w:sz w:val="20"/>
-          <w:szCs w:val="20"/>
-        </w:rPr>
-        <w:t>}</w:t>
-      </w:r>
     </w:p>
     <w:p>
       <w:pPr>
@@ -7456,23 +7438,33 @@
         <w:jc w:val="both"/>
         <w:rPr>
           <w:rFonts w:ascii="Arial" w:hAnsi="Arial" w:cs="Arial"/>
-        </w:rPr>
-      </w:pPr>
-      <w:r>
-        <w:rPr>
-          <w:rFonts w:ascii="Arial" w:hAnsi="Arial" w:cs="Arial"/>
-        </w:rPr>
-        <w:t>{#</w:t>
-      </w:r>
-      <w:r>
-        <w:rPr>
-          <w:rFonts w:ascii="Arial" w:hAnsi="Arial" w:cs="Arial"/>
-        </w:rPr>
-        <w:t>estadoOnlyAMAZONIA</w:t>
-      </w:r>
-      <w:r>
-        <w:rPr>
-          <w:rFonts w:ascii="Arial" w:hAnsi="Arial" w:cs="Arial"/>
+          <w:sz w:val="20"/>
+          <w:szCs w:val="20"/>
+        </w:rPr>
+      </w:pPr>
+      <w:r>
+        <w:rPr>
+          <w:rFonts w:ascii="Arial" w:hAnsi="Arial" w:cs="Arial"/>
+          <w:sz w:val="20"/>
+          <w:szCs w:val="20"/>
+        </w:rPr>
+        <w:t>{/</w:t>
+      </w:r>
+      <w:proofErr w:type="spellStart"/>
+      <w:r>
+        <w:rPr>
+          <w:rFonts w:ascii="Arial" w:hAnsi="Arial" w:cs="Arial"/>
+          <w:sz w:val="20"/>
+          <w:szCs w:val="20"/>
+        </w:rPr>
+        <w:t>estadoPECOyAMAZONIA</w:t>
+      </w:r>
+      <w:proofErr w:type="spellEnd"/>
+      <w:r>
+        <w:rPr>
+          <w:rFonts w:ascii="Arial" w:hAnsi="Arial" w:cs="Arial"/>
+          <w:sz w:val="20"/>
+          <w:szCs w:val="20"/>
         </w:rPr>
         <w:t>}</w:t>
       </w:r>
@@ -7486,6 +7478,25 @@
           <w:rFonts w:ascii="Arial" w:hAnsi="Arial" w:cs="Arial"/>
         </w:rPr>
       </w:pPr>
+      <w:r>
+        <w:rPr>
+          <w:rFonts w:ascii="Arial" w:hAnsi="Arial" w:cs="Arial"/>
+        </w:rPr>
+        <w:lastRenderedPageBreak/>
+        <w:t>{#</w:t>
+      </w:r>
+      <w:r>
+        <w:rPr>
+          <w:rFonts w:ascii="Arial" w:hAnsi="Arial" w:cs="Arial"/>
+        </w:rPr>
+        <w:t>estadoOnlyAMAZONIA</w:t>
+      </w:r>
+      <w:r>
+        <w:rPr>
+          <w:rFonts w:ascii="Arial" w:hAnsi="Arial" w:cs="Arial"/>
+        </w:rPr>
+        <w:t>}</w:t>
+      </w:r>
     </w:p>
     <w:p>
       <w:pPr>
@@ -7501,7 +7512,6 @@
         <w:rPr>
           <w:rFonts w:ascii="Arial" w:hAnsi="Arial" w:cs="Arial"/>
         </w:rPr>
-        <w:lastRenderedPageBreak/>
         <w:t xml:space="preserve">Que, de acuerdo a la solicitud de regularización/reconocimiento físico </w:t>
       </w:r>
       <w:r>
@@ -8662,7 +8672,7 @@
           <w:sz w:val="22"/>
           <w:szCs w:val="22"/>
         </w:rPr>
-        <w:t xml:space="preserve">días de la fecha de la factura; teniendo que la fecha de la factura digitalizada por el importador y remitida a esta administración es del </w:t>
+        <w:t xml:space="preserve">días de la fecha de la factura; teniendo que la fecha de la factura digitalizada por </w:t>
       </w:r>
       <w:r>
         <w:rPr>
@@ -8670,6 +8680,15 @@
           <w:sz w:val="22"/>
           <w:szCs w:val="22"/>
         </w:rPr>
+        <w:lastRenderedPageBreak/>
+        <w:t xml:space="preserve">el importador y remitida a esta administración es del </w:t>
+      </w:r>
+      <w:r>
+        <w:rPr>
+          <w:rFonts w:ascii="Arial" w:hAnsi="Arial"/>
+          <w:sz w:val="22"/>
+          <w:szCs w:val="22"/>
+        </w:rPr>
         <w:t>{</w:t>
       </w:r>
       <w:proofErr w:type="spellStart"/>
@@ -8679,16 +8698,7 @@
           <w:sz w:val="22"/>
           <w:szCs w:val="22"/>
         </w:rPr>
-        <w:t>datosFactura-</w:t>
-      </w:r>
-      <w:r>
-        <w:rPr>
-          <w:rFonts w:ascii="Arial" w:hAnsi="Arial"/>
-          <w:sz w:val="22"/>
-          <w:szCs w:val="22"/>
-        </w:rPr>
-        <w:lastRenderedPageBreak/>
-        <w:t>fechaFac</w:t>
+        <w:t>datosFactura-fechaFac</w:t>
       </w:r>
       <w:proofErr w:type="spellEnd"/>
       <w:r>
@@ -10251,7 +10261,16 @@
           <w:sz w:val="22"/>
           <w:szCs w:val="22"/>
         </w:rPr>
-        <w:t>con cargo a la “Sub - Cuenta Especial Tesoro Público Decreto Supremo n. º 015-94-EF”</w:t>
+        <w:t xml:space="preserve">con cargo a la “Sub - Cuenta Especial Tesoro Público Decreto </w:t>
+      </w:r>
+      <w:r>
+        <w:rPr>
+          <w:rFonts w:ascii="Arial" w:hAnsi="Arial" w:cs="Arial"/>
+          <w:sz w:val="22"/>
+          <w:szCs w:val="22"/>
+        </w:rPr>
+        <w:lastRenderedPageBreak/>
+        <w:t>Supremo n. º 015-94-EF”</w:t>
       </w:r>
       <w:r>
         <w:rPr>
@@ -10286,16 +10305,7 @@
           <w:sz w:val="22"/>
           <w:szCs w:val="22"/>
         </w:rPr>
-        <w:t xml:space="preserve"> cargo a la “Sub </w:t>
-      </w:r>
-      <w:r>
-        <w:rPr>
-          <w:rFonts w:ascii="Arial" w:hAnsi="Arial" w:cs="Arial"/>
-          <w:sz w:val="22"/>
-          <w:szCs w:val="22"/>
-        </w:rPr>
-        <w:lastRenderedPageBreak/>
-        <w:t xml:space="preserve">Cuenta Especial Tesoro Público Ley </w:t>
+        <w:t xml:space="preserve"> cargo a la “Sub Cuenta Especial Tesoro Público Ley </w:t>
       </w:r>
       <w:r>
         <w:rPr>
@@ -11121,6 +11131,54 @@
           <w:szCs w:val="22"/>
         </w:rPr>
         <w:t>}</w:t>
+      </w:r>
+    </w:p>
+    <w:p>
+      <w:pPr>
+        <w:tabs>
+          <w:tab w:val="left" w:pos="3544"/>
+        </w:tabs>
+        <w:spacing w:after="0" w:line="240" w:lineRule="auto"/>
+        <w:ind w:firstLine="3686"/>
+        <w:jc w:val="both"/>
+        <w:rPr>
+          <w:rFonts w:ascii="Arial" w:hAnsi="Arial" w:cs="Arial"/>
+          <w:sz w:val="22"/>
+          <w:szCs w:val="22"/>
+        </w:rPr>
+      </w:pPr>
+    </w:p>
+    <w:p>
+      <w:pPr>
+        <w:tabs>
+          <w:tab w:val="left" w:pos="3544"/>
+        </w:tabs>
+        <w:spacing w:after="0" w:line="240" w:lineRule="auto"/>
+        <w:ind w:firstLine="3686"/>
+        <w:jc w:val="both"/>
+        <w:rPr>
+          <w:rFonts w:ascii="Arial" w:hAnsi="Arial" w:cs="Arial"/>
+          <w:sz w:val="22"/>
+          <w:szCs w:val="22"/>
+        </w:rPr>
+      </w:pPr>
+    </w:p>
+    <w:p>
+      <w:pPr>
+        <w:pStyle w:val="xmsonormal"/>
+        <w:ind w:firstLine="3686"/>
+        <w:jc w:val="both"/>
+        <w:rPr>
+          <w:rFonts w:ascii="Arial" w:hAnsi="Arial" w:cs="Arial"/>
+          <w:lang w:eastAsia="en-US"/>
+        </w:rPr>
+      </w:pPr>
+      <w:r>
+        <w:rPr>
+          <w:rFonts w:ascii="Arial" w:hAnsi="Arial" w:cs="Arial"/>
+          <w:lang w:eastAsia="en-US"/>
+        </w:rPr>
+        <w:t>Regístrese, comuníquese y pase a la División de Técnica Aduanera, Recaudación y Contabilidad para su notificación al interesado y ejecución de la presente resolución.</w:t>
       </w:r>
     </w:p>
     <w:p>

</xml_diff>

<commit_message>
corregido tipadoFactura en resolucion
</commit_message>
<xml_diff>
--- a/interfaz3/semiPlantillaFinal.docx
+++ b/interfaz3/semiPlantillaFinal.docx
@@ -468,7 +468,19 @@
           <w:sz w:val="22"/>
           <w:szCs w:val="22"/>
         </w:rPr>
-        <w:t>{cuadroPedoAmazonia-numeroRegularizacionRRR</w:t>
+        <w:t>{cuadroPedoAmazonia-</w:t>
+      </w:r>
+      <w:proofErr w:type="gramStart"/>
+      <w:r>
+        <w:rPr>
+          <w:rFonts w:ascii="Arial" w:hAnsi="Arial" w:cs="Arial"/>
+          <w:b/>
+          <w:bCs/>
+          <w:color w:val="FF0000"/>
+          <w:sz w:val="22"/>
+          <w:szCs w:val="22"/>
+        </w:rPr>
+        <w:t>numeroRegularizacionRRR</w:t>
       </w:r>
       <w:r>
         <w:rPr>
@@ -489,6 +501,7 @@
         </w:rPr>
         <w:t>{</w:t>
       </w:r>
+      <w:proofErr w:type="gramEnd"/>
       <w:r>
         <w:rPr>
           <w:rFonts w:ascii="Arial" w:hAnsi="Arial" w:cs="Arial"/>
@@ -1890,7 +1903,16 @@
           <w:sz w:val="22"/>
           <w:szCs w:val="22"/>
         </w:rPr>
-        <w:t>fromDam-fechaCancelacionTributos</w:t>
+        <w:t>fromDam-</w:t>
+      </w:r>
+      <w:proofErr w:type="gramStart"/>
+      <w:r>
+        <w:rPr>
+          <w:rFonts w:ascii="Arial" w:hAnsi="Arial" w:cs="Arial"/>
+          <w:sz w:val="22"/>
+          <w:szCs w:val="22"/>
+        </w:rPr>
+        <w:t>fechaCancelacionTributos</w:t>
       </w:r>
       <w:r>
         <w:rPr>
@@ -1909,7 +1931,19 @@
           <w:sz w:val="22"/>
           <w:szCs w:val="22"/>
         </w:rPr>
-        <w:t>{fromDam-fechaCancelacionTributosRRR}</w:t>
+        <w:t>{</w:t>
+      </w:r>
+      <w:proofErr w:type="gramEnd"/>
+      <w:r>
+        <w:rPr>
+          <w:rFonts w:ascii="Arial" w:hAnsi="Arial" w:cs="Arial"/>
+          <w:b/>
+          <w:bCs/>
+          <w:color w:val="FF0000"/>
+          <w:sz w:val="22"/>
+          <w:szCs w:val="22"/>
+        </w:rPr>
+        <w:t>fromDam-fechaCancelacionTributosRRR}</w:t>
       </w:r>
       <w:r>
         <w:rPr>
@@ -2111,7 +2145,16 @@
           <w:sz w:val="22"/>
           <w:szCs w:val="22"/>
         </w:rPr>
-        <w:t>fromDam-fechaCancelacionTributos</w:t>
+        <w:t>fromDam-</w:t>
+      </w:r>
+      <w:proofErr w:type="gramStart"/>
+      <w:r>
+        <w:rPr>
+          <w:rFonts w:ascii="Arial" w:hAnsi="Arial" w:cs="Arial"/>
+          <w:sz w:val="22"/>
+          <w:szCs w:val="22"/>
+        </w:rPr>
+        <w:t>fechaCancelacionTributos</w:t>
       </w:r>
       <w:r>
         <w:rPr>
@@ -2130,7 +2173,19 @@
           <w:sz w:val="22"/>
           <w:szCs w:val="22"/>
         </w:rPr>
-        <w:t>{fromDam-fechaCancelacionTributosRRR}</w:t>
+        <w:t>{</w:t>
+      </w:r>
+      <w:proofErr w:type="gramEnd"/>
+      <w:r>
+        <w:rPr>
+          <w:rFonts w:ascii="Arial" w:hAnsi="Arial" w:cs="Arial"/>
+          <w:b/>
+          <w:bCs/>
+          <w:color w:val="FF0000"/>
+          <w:sz w:val="22"/>
+          <w:szCs w:val="22"/>
+        </w:rPr>
+        <w:t>fromDam-fechaCancelacionTributosRRR}</w:t>
       </w:r>
       <w:r>
         <w:rPr>
@@ -2771,7 +2826,19 @@
           <w:sz w:val="22"/>
           <w:szCs w:val="22"/>
         </w:rPr>
-        <w:t>fromInputs-fechaCorreoCecaRRR</w:t>
+        <w:t>fromInputs-</w:t>
+      </w:r>
+      <w:proofErr w:type="gramStart"/>
+      <w:r>
+        <w:rPr>
+          <w:rFonts w:ascii="Arial" w:hAnsi="Arial" w:cs="Arial"/>
+          <w:b/>
+          <w:bCs/>
+          <w:color w:val="FF0000"/>
+          <w:sz w:val="22"/>
+          <w:szCs w:val="22"/>
+        </w:rPr>
+        <w:t>fechaCorreoCecaRRR</w:t>
       </w:r>
       <w:proofErr w:type="spellEnd"/>
       <w:r>
@@ -2794,6 +2861,7 @@
         <w:t>{</w:t>
       </w:r>
       <w:proofErr w:type="spellStart"/>
+      <w:proofErr w:type="gramEnd"/>
       <w:r>
         <w:rPr>
           <w:rFonts w:ascii="Arial" w:hAnsi="Arial" w:cs="Arial"/>
@@ -2975,7 +3043,19 @@
           <w:sz w:val="22"/>
           <w:szCs w:val="22"/>
         </w:rPr>
-        <w:t>fromInputs-fechaAforoRRR</w:t>
+        <w:t>fromInputs-</w:t>
+      </w:r>
+      <w:proofErr w:type="gramStart"/>
+      <w:r>
+        <w:rPr>
+          <w:rFonts w:ascii="Arial" w:hAnsi="Arial" w:cs="Arial"/>
+          <w:b/>
+          <w:bCs/>
+          <w:color w:val="FF0000"/>
+          <w:sz w:val="22"/>
+          <w:szCs w:val="22"/>
+        </w:rPr>
+        <w:t>fechaAforoRRR</w:t>
       </w:r>
       <w:proofErr w:type="spellEnd"/>
       <w:r>
@@ -2998,6 +3078,7 @@
         <w:t>{</w:t>
       </w:r>
       <w:proofErr w:type="spellStart"/>
+      <w:proofErr w:type="gramEnd"/>
       <w:r>
         <w:rPr>
           <w:rFonts w:ascii="Arial" w:hAnsi="Arial" w:cs="Arial"/>
@@ -4188,7 +4269,16 @@
                 <w:sz w:val="20"/>
                 <w:szCs w:val="20"/>
               </w:rPr>
-              <w:t>am-descripcion</w:t>
+              <w:t>am-</w:t>
+            </w:r>
+            <w:proofErr w:type="gramStart"/>
+            <w:r>
+              <w:rPr>
+                <w:rFonts w:ascii="Arial" w:hAnsi="Arial" w:cs="Arial"/>
+                <w:sz w:val="20"/>
+                <w:szCs w:val="20"/>
+              </w:rPr>
+              <w:t>descripcion</w:t>
             </w:r>
             <w:r>
               <w:rPr>
@@ -4227,6 +4317,7 @@
               <w:t>{</w:t>
             </w:r>
             <w:proofErr w:type="spellStart"/>
+            <w:proofErr w:type="gramEnd"/>
             <w:r>
               <w:rPr>
                 <w:rFonts w:ascii="Arial" w:hAnsi="Arial" w:cs="Arial"/>
@@ -4590,7 +4681,14 @@
         <w:rPr>
           <w:rFonts w:ascii="Arial" w:hAnsi="Arial" w:cs="Arial"/>
         </w:rPr>
-        <w:t>fromDam-bultosReconocidos</w:t>
+        <w:t>fromDam-</w:t>
+      </w:r>
+      <w:proofErr w:type="gramStart"/>
+      <w:r>
+        <w:rPr>
+          <w:rFonts w:ascii="Arial" w:hAnsi="Arial" w:cs="Arial"/>
+        </w:rPr>
+        <w:t>bultosReconocidos</w:t>
       </w:r>
       <w:proofErr w:type="spellEnd"/>
       <w:r>
@@ -4609,6 +4707,7 @@
         <w:t>{</w:t>
       </w:r>
       <w:proofErr w:type="spellStart"/>
+      <w:proofErr w:type="gramEnd"/>
       <w:r>
         <w:rPr>
           <w:rFonts w:ascii="Arial" w:hAnsi="Arial" w:cs="Arial"/>
@@ -4766,7 +4865,17 @@
           <w:bCs/>
           <w:color w:val="FF0000"/>
         </w:rPr>
-        <w:t>fromInputs-lugarAforoRRR</w:t>
+        <w:t>fromInputs-</w:t>
+      </w:r>
+      <w:proofErr w:type="gramStart"/>
+      <w:r>
+        <w:rPr>
+          <w:rFonts w:ascii="Arial" w:hAnsi="Arial" w:cs="Arial"/>
+          <w:b/>
+          <w:bCs/>
+          <w:color w:val="FF0000"/>
+        </w:rPr>
+        <w:t>lugarAforoRRR</w:t>
       </w:r>
       <w:proofErr w:type="spellEnd"/>
       <w:r>
@@ -4785,6 +4894,7 @@
         <w:t>{</w:t>
       </w:r>
       <w:proofErr w:type="spellStart"/>
+      <w:proofErr w:type="gramEnd"/>
       <w:r>
         <w:rPr>
           <w:rFonts w:ascii="Arial" w:hAnsi="Arial" w:cs="Arial"/>
@@ -5085,6 +5195,7 @@
               </w:rPr>
               <w:t>{#</w:t>
             </w:r>
+            <w:proofErr w:type="gramStart"/>
             <w:r>
               <w:rPr>
                 <w:rFonts w:ascii="Arial" w:hAnsi="Arial" w:cs="Arial"/>
@@ -5096,7 +5207,15 @@
                 <w:rFonts w:ascii="Arial" w:eastAsiaTheme="minorHAnsi" w:hAnsi="Arial" w:cs="Arial"/>
                 <w:lang w:eastAsia="en-US"/>
               </w:rPr>
-              <w:t>}{numeroGuia}</w:t>
+              <w:t>}{</w:t>
+            </w:r>
+            <w:proofErr w:type="gramEnd"/>
+            <w:r>
+              <w:rPr>
+                <w:rFonts w:ascii="Arial" w:eastAsiaTheme="minorHAnsi" w:hAnsi="Arial" w:cs="Arial"/>
+                <w:lang w:eastAsia="en-US"/>
+              </w:rPr>
+              <w:t>numeroGuia}</w:t>
             </w:r>
           </w:p>
         </w:tc>
@@ -5183,12 +5302,21 @@
               </w:rPr>
               <w:t>ruc</w:t>
             </w:r>
+            <w:proofErr w:type="gramStart"/>
             <w:r>
               <w:rPr>
                 <w:rFonts w:ascii="Arial" w:eastAsiaTheme="minorHAnsi" w:hAnsi="Arial" w:cs="Arial"/>
                 <w:lang w:eastAsia="en-US"/>
               </w:rPr>
-              <w:t>}{/}</w:t>
+              <w:t>}{</w:t>
+            </w:r>
+            <w:proofErr w:type="gramEnd"/>
+            <w:r>
+              <w:rPr>
+                <w:rFonts w:ascii="Arial" w:eastAsiaTheme="minorHAnsi" w:hAnsi="Arial" w:cs="Arial"/>
+                <w:lang w:eastAsia="en-US"/>
+              </w:rPr>
+              <w:t>/}</w:t>
             </w:r>
           </w:p>
         </w:tc>
@@ -5620,7 +5748,25 @@
                 <w:b/>
                 <w:bCs/>
               </w:rPr>
-              <w:t>Ley N.º27037</w:t>
+              <w:t xml:space="preserve">Ley </w:t>
+            </w:r>
+            <w:proofErr w:type="gramStart"/>
+            <w:r>
+              <w:rPr>
+                <w:rFonts w:ascii="Arial" w:hAnsi="Arial" w:cs="Arial"/>
+                <w:b/>
+                <w:bCs/>
+              </w:rPr>
+              <w:t>N.º</w:t>
+            </w:r>
+            <w:proofErr w:type="gramEnd"/>
+            <w:r>
+              <w:rPr>
+                <w:rFonts w:ascii="Arial" w:hAnsi="Arial" w:cs="Arial"/>
+                <w:b/>
+                <w:bCs/>
+              </w:rPr>
+              <w:t>27037</w:t>
             </w:r>
           </w:p>
         </w:tc>
@@ -6434,7 +6580,29 @@
                 <w:sz w:val="20"/>
                 <w:szCs w:val="20"/>
               </w:rPr>
-              <w:t>Ley N.º27037</w:t>
+              <w:t xml:space="preserve">Ley </w:t>
+            </w:r>
+            <w:proofErr w:type="gramStart"/>
+            <w:r>
+              <w:rPr>
+                <w:rFonts w:ascii="Arial" w:hAnsi="Arial" w:cs="Arial"/>
+                <w:b/>
+                <w:bCs/>
+                <w:sz w:val="20"/>
+                <w:szCs w:val="20"/>
+              </w:rPr>
+              <w:t>N.º</w:t>
+            </w:r>
+            <w:proofErr w:type="gramEnd"/>
+            <w:r>
+              <w:rPr>
+                <w:rFonts w:ascii="Arial" w:hAnsi="Arial" w:cs="Arial"/>
+                <w:b/>
+                <w:bCs/>
+                <w:sz w:val="20"/>
+                <w:szCs w:val="20"/>
+              </w:rPr>
+              <w:t>27037</w:t>
             </w:r>
           </w:p>
         </w:tc>
@@ -8080,13 +8248,7 @@
         <w:rPr>
           <w:rFonts w:ascii="Arial" w:hAnsi="Arial" w:cs="Arial"/>
         </w:rPr>
-        <w:t>estadoPagadoFactura</w:t>
-      </w:r>
-      <w:r>
-        <w:rPr>
-          <w:rFonts w:ascii="Arial" w:hAnsi="Arial" w:cs="Arial"/>
-        </w:rPr>
-        <w:t>Invert</w:t>
+        <w:t>estadopagoFacturaTipoVencimiento</w:t>
       </w:r>
       <w:r>
         <w:rPr>
@@ -8158,7 +8320,14 @@
         <w:rPr>
           <w:rFonts w:ascii="Arial" w:hAnsi="Arial"/>
         </w:rPr>
-        <w:t>datosFactura-numeroReqFac</w:t>
+        <w:t>datosFactura-</w:t>
+      </w:r>
+      <w:proofErr w:type="gramStart"/>
+      <w:r>
+        <w:rPr>
+          <w:rFonts w:ascii="Arial" w:hAnsi="Arial"/>
+        </w:rPr>
+        <w:t>numeroReqFac</w:t>
       </w:r>
       <w:proofErr w:type="spellEnd"/>
       <w:r>
@@ -8177,6 +8346,7 @@
         <w:t>{</w:t>
       </w:r>
       <w:proofErr w:type="spellStart"/>
+      <w:proofErr w:type="gramEnd"/>
       <w:r>
         <w:rPr>
           <w:rFonts w:ascii="Arial" w:hAnsi="Arial"/>
@@ -8224,7 +8394,7 @@
           <w:sz w:val="22"/>
           <w:szCs w:val="22"/>
         </w:rPr>
-        <w:t xml:space="preserve">El importador a través del requerimiento </w:t>
+        <w:t xml:space="preserve">El importador a </w:t>
       </w:r>
       <w:r>
         <w:rPr>
@@ -8232,37 +8402,56 @@
           <w:sz w:val="22"/>
           <w:szCs w:val="22"/>
         </w:rPr>
-        <w:t>n</w:t>
-      </w:r>
+        <w:t>través del requerimiento n.º {</w:t>
+      </w:r>
+      <w:proofErr w:type="spellStart"/>
       <w:r>
         <w:rPr>
           <w:rFonts w:ascii="Arial" w:hAnsi="Arial"/>
           <w:sz w:val="22"/>
           <w:szCs w:val="22"/>
         </w:rPr>
-        <w:t xml:space="preserve">.º </w:t>
-      </w:r>
+        <w:t>datosFactura-numeroReqFac</w:t>
+      </w:r>
+      <w:proofErr w:type="spellEnd"/>
       <w:r>
         <w:rPr>
           <w:rFonts w:ascii="Arial" w:hAnsi="Arial"/>
           <w:sz w:val="22"/>
           <w:szCs w:val="22"/>
         </w:rPr>
+        <w:t>}</w:t>
+      </w:r>
+      <w:r>
+        <w:rPr>
+          <w:rFonts w:ascii="Arial" w:hAnsi="Arial"/>
+          <w:b/>
+          <w:bCs/>
+          <w:color w:val="FF0000"/>
+          <w:sz w:val="22"/>
+          <w:szCs w:val="22"/>
+        </w:rPr>
         <w:t>{</w:t>
       </w:r>
       <w:proofErr w:type="spellStart"/>
       <w:r>
         <w:rPr>
           <w:rFonts w:ascii="Arial" w:hAnsi="Arial"/>
-          <w:sz w:val="22"/>
-          <w:szCs w:val="22"/>
-        </w:rPr>
-        <w:t>datosFactura-numeroReqFac</w:t>
+          <w:b/>
+          <w:bCs/>
+          <w:color w:val="FF0000"/>
+          <w:sz w:val="22"/>
+          <w:szCs w:val="22"/>
+        </w:rPr>
+        <w:t>datosFactura-numeroReqFacRRR</w:t>
       </w:r>
       <w:proofErr w:type="spellEnd"/>
       <w:r>
         <w:rPr>
           <w:rFonts w:ascii="Arial" w:hAnsi="Arial"/>
+          <w:b/>
+          <w:bCs/>
+          <w:color w:val="FF0000"/>
           <w:sz w:val="22"/>
           <w:szCs w:val="22"/>
         </w:rPr>
@@ -8271,6 +8460,14 @@
       <w:r>
         <w:rPr>
           <w:rFonts w:ascii="Arial" w:hAnsi="Arial"/>
+          <w:sz w:val="22"/>
+          <w:szCs w:val="22"/>
+        </w:rPr>
+        <w:t xml:space="preserve"> de fecha </w:t>
+      </w:r>
+      <w:r>
+        <w:rPr>
+          <w:rFonts w:ascii="Arial" w:hAnsi="Arial"/>
           <w:b/>
           <w:bCs/>
           <w:color w:val="FF0000"/>
@@ -8289,7 +8486,7 @@
           <w:sz w:val="22"/>
           <w:szCs w:val="22"/>
         </w:rPr>
-        <w:t>datosFactura-numeroReqFacRRR</w:t>
+        <w:t>datosFactura-fechaReqFacRRR</w:t>
       </w:r>
       <w:proofErr w:type="spellEnd"/>
       <w:r>
@@ -8309,76 +8506,25 @@
           <w:sz w:val="22"/>
           <w:szCs w:val="22"/>
         </w:rPr>
-        <w:t xml:space="preserve"> de fecha </w:t>
-      </w:r>
+        <w:t>{</w:t>
+      </w:r>
+      <w:proofErr w:type="spellStart"/>
       <w:r>
         <w:rPr>
           <w:rFonts w:ascii="Arial" w:hAnsi="Arial"/>
-          <w:b/>
-          <w:bCs/>
-          <w:color w:val="FF0000"/>
-          <w:sz w:val="22"/>
-          <w:szCs w:val="22"/>
-        </w:rPr>
-        <w:t>{</w:t>
-      </w:r>
-      <w:proofErr w:type="spellStart"/>
+          <w:sz w:val="22"/>
+          <w:szCs w:val="22"/>
+        </w:rPr>
+        <w:t>datosFactura-fechaReqFac</w:t>
+      </w:r>
+      <w:proofErr w:type="spellEnd"/>
       <w:r>
         <w:rPr>
           <w:rFonts w:ascii="Arial" w:hAnsi="Arial"/>
-          <w:b/>
-          <w:bCs/>
-          <w:color w:val="FF0000"/>
-          <w:sz w:val="22"/>
-          <w:szCs w:val="22"/>
-        </w:rPr>
-        <w:t>datosFactura-fechaReqFacRRR</w:t>
-      </w:r>
-      <w:proofErr w:type="spellEnd"/>
-      <w:r>
-        <w:rPr>
-          <w:rFonts w:ascii="Arial" w:hAnsi="Arial"/>
-          <w:b/>
-          <w:bCs/>
-          <w:color w:val="FF0000"/>
-          <w:sz w:val="22"/>
-          <w:szCs w:val="22"/>
-        </w:rPr>
-        <w:t>}</w:t>
-      </w:r>
-      <w:r>
-        <w:rPr>
-          <w:rFonts w:ascii="Arial" w:hAnsi="Arial"/>
-          <w:sz w:val="22"/>
-          <w:szCs w:val="22"/>
-        </w:rPr>
-        <w:t>{</w:t>
-      </w:r>
-      <w:proofErr w:type="spellStart"/>
-      <w:r>
-        <w:rPr>
-          <w:rFonts w:ascii="Arial" w:hAnsi="Arial"/>
-          <w:sz w:val="22"/>
-          <w:szCs w:val="22"/>
-        </w:rPr>
-        <w:t>datosFactura-fechaReqFac</w:t>
-      </w:r>
-      <w:proofErr w:type="spellEnd"/>
-      <w:r>
-        <w:rPr>
-          <w:rFonts w:ascii="Arial" w:hAnsi="Arial"/>
-          <w:sz w:val="22"/>
-          <w:szCs w:val="22"/>
-        </w:rPr>
-        <w:t>}</w:t>
-      </w:r>
-      <w:r>
-        <w:rPr>
-          <w:rFonts w:ascii="Arial" w:hAnsi="Arial"/>
-          <w:sz w:val="22"/>
-          <w:szCs w:val="22"/>
-        </w:rPr>
-        <w:t xml:space="preserve"> presentó a esta administración la factura digitalizada, la misma que se encuentra detallada en  </w:t>
+          <w:sz w:val="22"/>
+          <w:szCs w:val="22"/>
+        </w:rPr>
+        <w:t xml:space="preserve">} presentó a esta administración la factura digitalizada, la misma que se encuentra detallada en  </w:t>
       </w:r>
       <w:r>
         <w:rPr>
@@ -8395,7 +8541,7 @@
           <w:sz w:val="22"/>
           <w:szCs w:val="22"/>
         </w:rPr>
-        <w:t>, se ha procedido a revisar y verificar las condiciones de pago establecidas entre el importador y su proveedor</w:t>
+        <w:t xml:space="preserve">, se ha procedido a revisar y verificar las condiciones de pago establecidas entre el importador y su proveedor, se observa que la fecha de pago de las mercancías es </w:t>
       </w:r>
       <w:r>
         <w:rPr>
@@ -8403,7 +8549,7 @@
           <w:sz w:val="22"/>
           <w:szCs w:val="22"/>
         </w:rPr>
-        <w:t xml:space="preserve">, se observa que la fecha de pago de las mercancías es </w:t>
+        <w:t>el {</w:t>
       </w:r>
       <w:r>
         <w:rPr>
@@ -8411,21 +8557,155 @@
           <w:sz w:val="22"/>
           <w:szCs w:val="22"/>
         </w:rPr>
+        <w:t>datosFactura</w:t>
+      </w:r>
+      <w:r>
+        <w:rPr>
+          <w:rFonts w:ascii="Arial" w:hAnsi="Arial"/>
+          <w:sz w:val="22"/>
+          <w:szCs w:val="22"/>
+        </w:rPr>
+        <w:t>-</w:t>
+      </w:r>
+      <w:r>
+        <w:rPr>
+          <w:rFonts w:ascii="Arial" w:hAnsi="Arial"/>
+          <w:sz w:val="22"/>
+          <w:szCs w:val="22"/>
+        </w:rPr>
+        <w:t>fechaVencimiento}</w:t>
+      </w:r>
+      <w:r>
+        <w:rPr>
+          <w:rFonts w:ascii="Arial" w:hAnsi="Arial"/>
+          <w:b/>
+          <w:bCs/>
+          <w:color w:val="FF0000"/>
+          <w:sz w:val="22"/>
+          <w:szCs w:val="22"/>
+        </w:rPr>
+        <w:t>{datosFactura</w:t>
+      </w:r>
+      <w:r>
+        <w:rPr>
+          <w:rFonts w:ascii="Arial" w:hAnsi="Arial"/>
+          <w:b/>
+          <w:bCs/>
+          <w:color w:val="FF0000"/>
+          <w:sz w:val="22"/>
+          <w:szCs w:val="22"/>
+        </w:rPr>
+        <w:t>-</w:t>
+      </w:r>
+      <w:r>
+        <w:rPr>
+          <w:rFonts w:ascii="Arial" w:hAnsi="Arial"/>
+          <w:b/>
+          <w:bCs/>
+          <w:color w:val="FF0000"/>
+          <w:sz w:val="22"/>
+          <w:szCs w:val="22"/>
+        </w:rPr>
+        <w:t>fechaVencimientoRRR}</w:t>
+      </w:r>
+      <w:r>
+        <w:rPr>
+          <w:rFonts w:ascii="Arial" w:hAnsi="Arial"/>
+          <w:color w:val="FF0000"/>
+          <w:sz w:val="22"/>
+          <w:szCs w:val="22"/>
+        </w:rPr>
+        <w:t xml:space="preserve"> </w:t>
+      </w:r>
+      <w:r>
+        <w:rPr>
+          <w:rFonts w:ascii="Arial" w:hAnsi="Arial"/>
+          <w:sz w:val="22"/>
+          <w:szCs w:val="22"/>
+        </w:rPr>
+        <w:t xml:space="preserve">tal como se </w:t>
+      </w:r>
+      <w:r>
+        <w:rPr>
+          <w:rFonts w:ascii="Arial" w:hAnsi="Arial"/>
+          <w:sz w:val="22"/>
+          <w:szCs w:val="22"/>
+        </w:rPr>
+        <w:t>observa en la factura digitalizada por el importador y remitida a esta administración</w:t>
+      </w:r>
+      <w:r>
+        <w:rPr>
+          <w:rFonts w:ascii="Arial" w:hAnsi="Arial"/>
+          <w:sz w:val="22"/>
+          <w:szCs w:val="22"/>
+        </w:rPr>
+        <w:t xml:space="preserve">, por tanto </w:t>
+      </w:r>
+      <w:r>
+        <w:rPr>
+          <w:rFonts w:ascii="Arial" w:hAnsi="Arial"/>
+          <w:sz w:val="22"/>
+          <w:szCs w:val="22"/>
+        </w:rPr>
+        <w:t xml:space="preserve">se evidencia que el </w:t>
+      </w:r>
+      <w:r>
+        <w:rPr>
+          <w:rFonts w:ascii="Arial" w:hAnsi="Arial"/>
+          <w:sz w:val="22"/>
+          <w:szCs w:val="22"/>
+        </w:rPr>
+        <w:lastRenderedPageBreak/>
+        <w:t>importador todavía se encuentra dentro del plazo para realizar la transferencia por el pago de las mercancías; en tal sentido, corresponde la devolución solicitada por {</w:t>
+      </w:r>
+      <w:proofErr w:type="spellStart"/>
+      <w:r>
+        <w:rPr>
+          <w:rFonts w:ascii="Arial" w:hAnsi="Arial"/>
+          <w:sz w:val="22"/>
+          <w:szCs w:val="22"/>
+        </w:rPr>
+        <w:t>fromDam-nombreEmpresa</w:t>
+      </w:r>
+      <w:proofErr w:type="spellEnd"/>
+      <w:r>
+        <w:rPr>
+          <w:rFonts w:ascii="Arial" w:hAnsi="Arial"/>
+          <w:sz w:val="22"/>
+          <w:szCs w:val="22"/>
+        </w:rPr>
+        <w:t>}</w:t>
+      </w:r>
+      <w:r>
+        <w:rPr>
+          <w:rFonts w:ascii="Arial" w:hAnsi="Arial"/>
+          <w:b/>
+          <w:bCs/>
+          <w:color w:val="FF0000"/>
+          <w:sz w:val="22"/>
+          <w:szCs w:val="22"/>
+        </w:rPr>
         <w:t>{</w:t>
       </w:r>
       <w:proofErr w:type="spellStart"/>
       <w:r>
         <w:rPr>
           <w:rFonts w:ascii="Arial" w:hAnsi="Arial"/>
-          <w:sz w:val="22"/>
-          <w:szCs w:val="22"/>
-        </w:rPr>
-        <w:t>datosFactura-plazoFac</w:t>
+          <w:b/>
+          <w:bCs/>
+          <w:color w:val="FF0000"/>
+          <w:sz w:val="22"/>
+          <w:szCs w:val="22"/>
+        </w:rPr>
+        <w:t>fromDam-nombreEmpresaRRR</w:t>
       </w:r>
       <w:proofErr w:type="spellEnd"/>
       <w:r>
         <w:rPr>
           <w:rFonts w:ascii="Arial" w:hAnsi="Arial"/>
+          <w:b/>
+          <w:bCs/>
+          <w:color w:val="FF0000"/>
           <w:sz w:val="22"/>
           <w:szCs w:val="22"/>
         </w:rPr>
@@ -8434,42 +8714,32 @@
       <w:r>
         <w:rPr>
           <w:rFonts w:ascii="Arial" w:hAnsi="Arial"/>
-          <w:b/>
-          <w:bCs/>
-          <w:color w:val="FF0000"/>
-          <w:sz w:val="22"/>
-          <w:szCs w:val="22"/>
-        </w:rPr>
-        <w:t>{</w:t>
+          <w:sz w:val="22"/>
+          <w:szCs w:val="22"/>
+        </w:rPr>
+        <w:t>. identificada con RUC n.º {</w:t>
       </w:r>
       <w:proofErr w:type="spellStart"/>
       <w:r>
         <w:rPr>
           <w:rFonts w:ascii="Arial" w:hAnsi="Arial"/>
-          <w:b/>
-          <w:bCs/>
-          <w:color w:val="FF0000"/>
-          <w:sz w:val="22"/>
-          <w:szCs w:val="22"/>
-        </w:rPr>
-        <w:t>datosFactura-plazoFacRRR</w:t>
+          <w:sz w:val="22"/>
+          <w:szCs w:val="22"/>
+        </w:rPr>
+        <w:t>fromDam</w:t>
       </w:r>
       <w:proofErr w:type="spellEnd"/>
       <w:r>
         <w:rPr>
           <w:rFonts w:ascii="Arial" w:hAnsi="Arial"/>
-          <w:b/>
-          <w:bCs/>
-          <w:color w:val="FF0000"/>
-          <w:sz w:val="22"/>
-          <w:szCs w:val="22"/>
-        </w:rPr>
-        <w:t>}</w:t>
+          <w:sz w:val="22"/>
+          <w:szCs w:val="22"/>
+        </w:rPr>
+        <w:t>-ruc} al amparo de la Ley n.º 27037, al no configurar la exclusión establecida en el artículo 8° de la</w:t>
       </w:r>
       <w:r>
         <w:rPr>
           <w:rFonts w:ascii="Arial" w:hAnsi="Arial"/>
-          <w:color w:val="FF0000"/>
           <w:sz w:val="22"/>
           <w:szCs w:val="22"/>
         </w:rPr>
@@ -8481,7 +8751,7 @@
           <w:sz w:val="22"/>
           <w:szCs w:val="22"/>
         </w:rPr>
-        <w:t xml:space="preserve">días de la fecha de la factura; teniendo que la fecha de la factura digitalizada por el importador y remitida a esta administración es del </w:t>
+        <w:t>Mencionada</w:t>
       </w:r>
       <w:r>
         <w:rPr>
@@ -8489,254 +8759,26 @@
           <w:sz w:val="22"/>
           <w:szCs w:val="22"/>
         </w:rPr>
-        <w:t>{</w:t>
-      </w:r>
-      <w:proofErr w:type="spellStart"/>
-      <w:r>
-        <w:rPr>
-          <w:rFonts w:ascii="Arial" w:hAnsi="Arial"/>
-          <w:sz w:val="22"/>
-          <w:szCs w:val="22"/>
-        </w:rPr>
-        <w:t>datosFactura-</w:t>
-      </w:r>
-      <w:r>
-        <w:rPr>
-          <w:rFonts w:ascii="Arial" w:hAnsi="Arial"/>
-          <w:sz w:val="22"/>
-          <w:szCs w:val="22"/>
-        </w:rPr>
-        <w:lastRenderedPageBreak/>
-        <w:t>fechaFac</w:t>
-      </w:r>
-      <w:proofErr w:type="spellEnd"/>
-      <w:r>
-        <w:rPr>
-          <w:rFonts w:ascii="Arial" w:hAnsi="Arial"/>
-          <w:sz w:val="22"/>
-          <w:szCs w:val="22"/>
-        </w:rPr>
-        <w:t>}</w:t>
-      </w:r>
-      <w:r>
-        <w:rPr>
-          <w:rFonts w:ascii="Arial" w:hAnsi="Arial"/>
-          <w:b/>
-          <w:bCs/>
-          <w:color w:val="FF0000"/>
-          <w:sz w:val="22"/>
-          <w:szCs w:val="22"/>
-        </w:rPr>
-        <w:t>{</w:t>
-      </w:r>
-      <w:proofErr w:type="spellStart"/>
-      <w:r>
-        <w:rPr>
-          <w:rFonts w:ascii="Arial" w:hAnsi="Arial"/>
-          <w:b/>
-          <w:bCs/>
-          <w:color w:val="FF0000"/>
-          <w:sz w:val="22"/>
-          <w:szCs w:val="22"/>
-        </w:rPr>
-        <w:t>datosFactura-fechaFacRRR</w:t>
-      </w:r>
-      <w:proofErr w:type="spellEnd"/>
-      <w:r>
-        <w:rPr>
-          <w:rFonts w:ascii="Arial" w:hAnsi="Arial"/>
-          <w:b/>
-          <w:bCs/>
-          <w:color w:val="FF0000"/>
-          <w:sz w:val="22"/>
-          <w:szCs w:val="22"/>
-        </w:rPr>
-        <w:t>}</w:t>
-      </w:r>
-      <w:r>
-        <w:rPr>
-          <w:rFonts w:ascii="Arial" w:hAnsi="Arial"/>
-          <w:b/>
-          <w:bCs/>
-          <w:color w:val="FF0000"/>
-          <w:sz w:val="22"/>
-          <w:szCs w:val="22"/>
-        </w:rPr>
-        <w:t xml:space="preserve">,  </w:t>
-      </w:r>
-      <w:r>
-        <w:rPr>
-          <w:rFonts w:ascii="Arial" w:hAnsi="Arial"/>
-          <w:sz w:val="22"/>
-          <w:szCs w:val="22"/>
-        </w:rPr>
-        <w:t>se evidencia que el importador todavía se encuentra dentro del plazo para realizar la transferencia por el pago de las mercancías;</w:t>
-      </w:r>
-      <w:r>
-        <w:rPr>
-          <w:rFonts w:ascii="Arial" w:hAnsi="Arial"/>
-          <w:sz w:val="22"/>
-          <w:szCs w:val="22"/>
-        </w:rPr>
-        <w:t xml:space="preserve"> en tal sentido, corresponde la devolución solicitada por </w:t>
-      </w:r>
-      <w:r>
-        <w:rPr>
-          <w:rFonts w:ascii="Arial" w:hAnsi="Arial"/>
-          <w:sz w:val="22"/>
-          <w:szCs w:val="22"/>
-        </w:rPr>
-        <w:t>{</w:t>
-      </w:r>
-      <w:proofErr w:type="spellStart"/>
-      <w:r>
-        <w:rPr>
-          <w:rFonts w:ascii="Arial" w:hAnsi="Arial"/>
-          <w:sz w:val="22"/>
-          <w:szCs w:val="22"/>
-        </w:rPr>
-        <w:t>fromDam-nombreEmpresa</w:t>
-      </w:r>
-      <w:proofErr w:type="spellEnd"/>
-      <w:r>
-        <w:rPr>
-          <w:rFonts w:ascii="Arial" w:hAnsi="Arial"/>
-          <w:sz w:val="22"/>
-          <w:szCs w:val="22"/>
-        </w:rPr>
-        <w:t>}</w:t>
-      </w:r>
-      <w:r>
-        <w:rPr>
-          <w:rFonts w:ascii="Arial" w:hAnsi="Arial"/>
-          <w:b/>
-          <w:bCs/>
-          <w:color w:val="FF0000"/>
-          <w:sz w:val="22"/>
-          <w:szCs w:val="22"/>
-        </w:rPr>
-        <w:t>{</w:t>
-      </w:r>
-      <w:proofErr w:type="spellStart"/>
-      <w:r>
-        <w:rPr>
-          <w:rFonts w:ascii="Arial" w:hAnsi="Arial"/>
-          <w:b/>
-          <w:bCs/>
-          <w:color w:val="FF0000"/>
-          <w:sz w:val="22"/>
-          <w:szCs w:val="22"/>
-        </w:rPr>
-        <w:t>fromDam-nombreEmpresaRRR</w:t>
-      </w:r>
-      <w:proofErr w:type="spellEnd"/>
-      <w:r>
-        <w:rPr>
-          <w:rFonts w:ascii="Arial" w:hAnsi="Arial"/>
-          <w:b/>
-          <w:bCs/>
-          <w:color w:val="FF0000"/>
-          <w:sz w:val="22"/>
-          <w:szCs w:val="22"/>
-        </w:rPr>
-        <w:t>}</w:t>
-      </w:r>
-      <w:r>
-        <w:rPr>
-          <w:rFonts w:ascii="Arial" w:hAnsi="Arial"/>
-          <w:sz w:val="22"/>
-          <w:szCs w:val="22"/>
-        </w:rPr>
-        <w:t xml:space="preserve">. identificada con RUC </w:t>
-      </w:r>
-      <w:r>
-        <w:rPr>
-          <w:rFonts w:ascii="Arial" w:hAnsi="Arial"/>
-          <w:sz w:val="22"/>
-          <w:szCs w:val="22"/>
-        </w:rPr>
-        <w:t>n</w:t>
-      </w:r>
-      <w:r>
-        <w:rPr>
-          <w:rFonts w:ascii="Arial" w:hAnsi="Arial"/>
-          <w:sz w:val="22"/>
-          <w:szCs w:val="22"/>
-        </w:rPr>
-        <w:t xml:space="preserve">.º </w:t>
-      </w:r>
-      <w:r>
-        <w:rPr>
-          <w:rFonts w:ascii="Arial" w:hAnsi="Arial"/>
-          <w:sz w:val="22"/>
-          <w:szCs w:val="22"/>
-        </w:rPr>
-        <w:t>{</w:t>
-      </w:r>
-      <w:proofErr w:type="spellStart"/>
-      <w:r>
-        <w:rPr>
-          <w:rFonts w:ascii="Arial" w:hAnsi="Arial"/>
-          <w:sz w:val="22"/>
-          <w:szCs w:val="22"/>
-        </w:rPr>
-        <w:t>fromDam</w:t>
-      </w:r>
-      <w:proofErr w:type="spellEnd"/>
-      <w:r>
-        <w:rPr>
-          <w:rFonts w:ascii="Arial" w:hAnsi="Arial"/>
-          <w:sz w:val="22"/>
-          <w:szCs w:val="22"/>
-        </w:rPr>
-        <w:t>-ruc}</w:t>
-      </w:r>
-      <w:r>
-        <w:rPr>
-          <w:rFonts w:ascii="Arial" w:hAnsi="Arial"/>
-          <w:sz w:val="22"/>
-          <w:szCs w:val="22"/>
-        </w:rPr>
-        <w:t xml:space="preserve"> al amparo de la Ley </w:t>
-      </w:r>
-      <w:r>
-        <w:rPr>
-          <w:rFonts w:ascii="Arial" w:hAnsi="Arial"/>
-          <w:sz w:val="22"/>
-          <w:szCs w:val="22"/>
-        </w:rPr>
-        <w:t>n</w:t>
-      </w:r>
-      <w:r>
-        <w:rPr>
-          <w:rFonts w:ascii="Arial" w:hAnsi="Arial"/>
-          <w:sz w:val="22"/>
-          <w:szCs w:val="22"/>
-        </w:rPr>
-        <w:t>.º 27037</w:t>
-      </w:r>
-      <w:r>
-        <w:rPr>
-          <w:rFonts w:ascii="Arial" w:hAnsi="Arial"/>
-          <w:sz w:val="22"/>
-          <w:szCs w:val="22"/>
-        </w:rPr>
-        <w:t xml:space="preserve">, </w:t>
-      </w:r>
-      <w:r>
-        <w:rPr>
-          <w:rFonts w:ascii="Arial" w:hAnsi="Arial"/>
-          <w:sz w:val="22"/>
-          <w:szCs w:val="22"/>
-        </w:rPr>
-        <w:t>al no configurar la exclusión establecida en el artículo 8° de la Mencionada Ley;</w:t>
-      </w:r>
-    </w:p>
-    <w:p>
-      <w:pPr>
+        <w:t xml:space="preserve"> Ley;</w:t>
+      </w:r>
+    </w:p>
+    <w:p>
+      <w:pPr>
+        <w:pStyle w:val="Prrafodelista"/>
         <w:spacing w:before="120" w:after="0" w:line="259" w:lineRule="auto"/>
         <w:jc w:val="both"/>
         <w:rPr>
+          <w:rFonts w:ascii="Arial" w:hAnsi="Arial"/>
+          <w:sz w:val="22"/>
+          <w:szCs w:val="22"/>
+        </w:rPr>
+      </w:pPr>
+    </w:p>
+    <w:p>
+      <w:pPr>
+        <w:spacing w:before="120" w:after="0" w:line="259" w:lineRule="auto"/>
+        <w:jc w:val="both"/>
+        <w:rPr>
           <w:rFonts w:ascii="Arial" w:hAnsi="Arial" w:cs="Arial"/>
           <w:sz w:val="22"/>
           <w:szCs w:val="22"/>
@@ -8750,6 +8792,7 @@
         </w:rPr>
         <w:t>{/</w:t>
       </w:r>
+      <w:bookmarkStart w:id="2" w:name="_Hlk231302066"/>
       <w:proofErr w:type="spellStart"/>
       <w:r>
         <w:rPr>
@@ -8757,16 +8800,9 @@
           <w:sz w:val="22"/>
           <w:szCs w:val="22"/>
         </w:rPr>
-        <w:t>estadoPagadoFactura</w:t>
-      </w:r>
-      <w:r>
-        <w:rPr>
-          <w:rFonts w:ascii="Arial" w:hAnsi="Arial" w:cs="Arial"/>
-          <w:sz w:val="22"/>
-          <w:szCs w:val="22"/>
-        </w:rPr>
-        <w:t>Invert</w:t>
-      </w:r>
+        <w:t>estadopagoFacturaTipoVencimiento</w:t>
+      </w:r>
+      <w:bookmarkEnd w:id="2"/>
       <w:proofErr w:type="spellEnd"/>
       <w:r>
         <w:rPr>
@@ -8796,7 +8832,7 @@
         <w:rPr>
           <w:rFonts w:ascii="Arial" w:hAnsi="Arial" w:cs="Arial"/>
         </w:rPr>
-        <w:t>estadoPagadoFactura</w:t>
+        <w:t>estadoPagoFacturaTipoPlazo</w:t>
       </w:r>
       <w:r>
         <w:rPr>
@@ -8819,67 +8855,547 @@
         <w:rPr>
           <w:rFonts w:ascii="Arial" w:hAnsi="Arial"/>
         </w:rPr>
-        <w:t xml:space="preserve">Que, </w:t>
+        <w:t xml:space="preserve">Que, La Ley </w:t>
       </w:r>
       <w:r>
         <w:rPr>
           <w:rFonts w:ascii="Arial" w:hAnsi="Arial"/>
         </w:rPr>
-        <w:t xml:space="preserve">La Ley </w:t>
+        <w:t>n.º</w:t>
       </w:r>
       <w:r>
         <w:rPr>
           <w:rFonts w:ascii="Arial" w:hAnsi="Arial"/>
         </w:rPr>
-        <w:t>n</w:t>
+        <w:t xml:space="preserve"> 28194 “Ley para la Lucha contra la Evasión y para la Formalización de la Economía” establece en su artículo 3-A la obligatoriedad del uso de medios de pago en la compraventa internacional de mercancías, en tal sentido, se procedió a evaluar la </w:t>
       </w:r>
       <w:r>
         <w:rPr>
           <w:rFonts w:ascii="Arial" w:hAnsi="Arial"/>
         </w:rPr>
-        <w:t>.º 28194 “Ley para la Lucha contra la Evasión y para la Formalización de la Economía” establece en su artículo 3-A la obligatoriedad del uso de medios de pago en la compraventa internacional de mercancías, en tal sentido, se procedió a evaluar la factura remitida por el administrado y los medios de pago adjuntado</w:t>
+        <w:t>f</w:t>
       </w:r>
       <w:r>
         <w:rPr>
           <w:rFonts w:ascii="Arial" w:hAnsi="Arial"/>
         </w:rPr>
-        <w:t>s</w:t>
+        <w:t xml:space="preserve">actura remitida por el administrado a través del </w:t>
       </w:r>
       <w:r>
         <w:rPr>
           <w:rFonts w:ascii="Arial" w:hAnsi="Arial"/>
         </w:rPr>
-        <w:t>, por lo cual s</w:t>
-      </w:r>
+        <w:t>requerimiento N.º {</w:t>
+      </w:r>
+      <w:proofErr w:type="spellStart"/>
       <w:r>
         <w:rPr>
           <w:rFonts w:ascii="Arial" w:hAnsi="Arial"/>
         </w:rPr>
-        <w:t>í</w:t>
-      </w:r>
+        <w:t>datosFactura-</w:t>
+      </w:r>
+      <w:proofErr w:type="gramStart"/>
       <w:r>
         <w:rPr>
           <w:rFonts w:ascii="Arial" w:hAnsi="Arial"/>
         </w:rPr>
-        <w:t xml:space="preserve"> acredit</w:t>
-      </w:r>
+        <w:t>numeroReqFac</w:t>
+      </w:r>
+      <w:proofErr w:type="spellEnd"/>
       <w:r>
         <w:rPr>
           <w:rFonts w:ascii="Arial" w:hAnsi="Arial"/>
         </w:rPr>
-        <w:t>ó</w:t>
+        <w:t>}</w:t>
       </w:r>
       <w:r>
         <w:rPr>
           <w:rFonts w:ascii="Arial" w:hAnsi="Arial"/>
-        </w:rPr>
-        <w:t xml:space="preserve"> los medios de pago correspondiente</w:t>
-      </w:r>
+          <w:b/>
+          <w:bCs/>
+          <w:color w:val="FF0000"/>
+        </w:rPr>
+        <w:t>{</w:t>
+      </w:r>
+      <w:proofErr w:type="spellStart"/>
+      <w:proofErr w:type="gramEnd"/>
       <w:r>
         <w:rPr>
           <w:rFonts w:ascii="Arial" w:hAnsi="Arial"/>
+          <w:b/>
+          <w:bCs/>
+          <w:color w:val="FF0000"/>
+        </w:rPr>
+        <w:t>datosFactura-numeroReqFacRRR</w:t>
+      </w:r>
+      <w:proofErr w:type="spellEnd"/>
+      <w:r>
+        <w:rPr>
+          <w:rFonts w:ascii="Arial" w:hAnsi="Arial"/>
+          <w:b/>
+          <w:bCs/>
+          <w:color w:val="FF0000"/>
+        </w:rPr>
+        <w:t>}</w:t>
+      </w:r>
+      <w:r>
+        <w:rPr>
+          <w:rFonts w:ascii="Arial" w:hAnsi="Arial"/>
         </w:rPr>
         <w:t xml:space="preserve">; </w:t>
+      </w:r>
+    </w:p>
+    <w:p>
+      <w:pPr>
+        <w:pStyle w:val="Prrafodelista"/>
+        <w:numPr>
+          <w:ilvl w:val="0"/>
+          <w:numId w:val="1"/>
+        </w:numPr>
+        <w:spacing w:before="120" w:after="0" w:line="259" w:lineRule="auto"/>
+        <w:jc w:val="both"/>
+        <w:rPr>
+          <w:rFonts w:ascii="Arial" w:hAnsi="Arial"/>
+          <w:sz w:val="22"/>
+          <w:szCs w:val="22"/>
+        </w:rPr>
+      </w:pPr>
+      <w:r>
+        <w:rPr>
+          <w:rFonts w:ascii="Arial" w:hAnsi="Arial"/>
+          <w:sz w:val="22"/>
+          <w:szCs w:val="22"/>
+        </w:rPr>
+        <w:t xml:space="preserve">El importador a </w:t>
+      </w:r>
+      <w:r>
+        <w:rPr>
+          <w:rFonts w:ascii="Arial" w:hAnsi="Arial"/>
+          <w:sz w:val="22"/>
+          <w:szCs w:val="22"/>
+        </w:rPr>
+        <w:t>través del requerimiento n.º {</w:t>
+      </w:r>
+      <w:proofErr w:type="spellStart"/>
+      <w:r>
+        <w:rPr>
+          <w:rFonts w:ascii="Arial" w:hAnsi="Arial"/>
+          <w:sz w:val="22"/>
+          <w:szCs w:val="22"/>
+        </w:rPr>
+        <w:t>datosFactura-numeroReqFac</w:t>
+      </w:r>
+      <w:proofErr w:type="spellEnd"/>
+      <w:r>
+        <w:rPr>
+          <w:rFonts w:ascii="Arial" w:hAnsi="Arial"/>
+          <w:sz w:val="22"/>
+          <w:szCs w:val="22"/>
+        </w:rPr>
+        <w:t>}</w:t>
+      </w:r>
+      <w:r>
+        <w:rPr>
+          <w:rFonts w:ascii="Arial" w:hAnsi="Arial"/>
+          <w:b/>
+          <w:bCs/>
+          <w:color w:val="FF0000"/>
+          <w:sz w:val="22"/>
+          <w:szCs w:val="22"/>
+        </w:rPr>
+        <w:t>{</w:t>
+      </w:r>
+      <w:proofErr w:type="spellStart"/>
+      <w:r>
+        <w:rPr>
+          <w:rFonts w:ascii="Arial" w:hAnsi="Arial"/>
+          <w:b/>
+          <w:bCs/>
+          <w:color w:val="FF0000"/>
+          <w:sz w:val="22"/>
+          <w:szCs w:val="22"/>
+        </w:rPr>
+        <w:t>datosFactura-numeroReqFacRRR</w:t>
+      </w:r>
+      <w:proofErr w:type="spellEnd"/>
+      <w:r>
+        <w:rPr>
+          <w:rFonts w:ascii="Arial" w:hAnsi="Arial"/>
+          <w:b/>
+          <w:bCs/>
+          <w:color w:val="FF0000"/>
+          <w:sz w:val="22"/>
+          <w:szCs w:val="22"/>
+        </w:rPr>
+        <w:t>}</w:t>
+      </w:r>
+      <w:r>
+        <w:rPr>
+          <w:rFonts w:ascii="Arial" w:hAnsi="Arial"/>
+          <w:sz w:val="22"/>
+          <w:szCs w:val="22"/>
+        </w:rPr>
+        <w:t xml:space="preserve"> de fecha </w:t>
+      </w:r>
+      <w:r>
+        <w:rPr>
+          <w:rFonts w:ascii="Arial" w:hAnsi="Arial"/>
+          <w:b/>
+          <w:bCs/>
+          <w:color w:val="FF0000"/>
+          <w:sz w:val="22"/>
+          <w:szCs w:val="22"/>
+        </w:rPr>
+        <w:t>{</w:t>
+      </w:r>
+      <w:proofErr w:type="spellStart"/>
+      <w:r>
+        <w:rPr>
+          <w:rFonts w:ascii="Arial" w:hAnsi="Arial"/>
+          <w:b/>
+          <w:bCs/>
+          <w:color w:val="FF0000"/>
+          <w:sz w:val="22"/>
+          <w:szCs w:val="22"/>
+        </w:rPr>
+        <w:t>datosFactura-fechaReqFacRRR</w:t>
+      </w:r>
+      <w:proofErr w:type="spellEnd"/>
+      <w:r>
+        <w:rPr>
+          <w:rFonts w:ascii="Arial" w:hAnsi="Arial"/>
+          <w:b/>
+          <w:bCs/>
+          <w:color w:val="FF0000"/>
+          <w:sz w:val="22"/>
+          <w:szCs w:val="22"/>
+        </w:rPr>
+        <w:t>}</w:t>
+      </w:r>
+      <w:r>
+        <w:rPr>
+          <w:rFonts w:ascii="Arial" w:hAnsi="Arial"/>
+          <w:sz w:val="22"/>
+          <w:szCs w:val="22"/>
+        </w:rPr>
+        <w:t>{</w:t>
+      </w:r>
+      <w:proofErr w:type="spellStart"/>
+      <w:r>
+        <w:rPr>
+          <w:rFonts w:ascii="Arial" w:hAnsi="Arial"/>
+          <w:sz w:val="22"/>
+          <w:szCs w:val="22"/>
+        </w:rPr>
+        <w:t>datosFactura-fechaReqFac</w:t>
+      </w:r>
+      <w:proofErr w:type="spellEnd"/>
+      <w:r>
+        <w:rPr>
+          <w:rFonts w:ascii="Arial" w:hAnsi="Arial"/>
+          <w:sz w:val="22"/>
+          <w:szCs w:val="22"/>
+        </w:rPr>
+        <w:t xml:space="preserve">} presentó a esta administración la factura digitalizada, la misma que se encuentra detallada en  </w:t>
+      </w:r>
+      <w:r>
+        <w:rPr>
+          <w:rStyle w:val="normaltextrun"/>
+          <w:rFonts w:ascii="Arial" w:hAnsi="Arial"/>
+          <w:sz w:val="22"/>
+          <w:szCs w:val="22"/>
+        </w:rPr>
+        <w:t>la casilla 4.1 del Formato B</w:t>
+      </w:r>
+      <w:r>
+        <w:rPr>
+          <w:rFonts w:ascii="Arial" w:hAnsi="Arial"/>
+          <w:sz w:val="22"/>
+          <w:szCs w:val="22"/>
+        </w:rPr>
+        <w:t>, se ha procedido a revisar y verificar las condiciones de pago establecidas entre el importador y su proveedor, se observa que la fecha de pago de las mercancías es {</w:t>
+      </w:r>
+      <w:proofErr w:type="spellStart"/>
+      <w:r>
+        <w:rPr>
+          <w:rFonts w:ascii="Arial" w:hAnsi="Arial"/>
+          <w:sz w:val="22"/>
+          <w:szCs w:val="22"/>
+        </w:rPr>
+        <w:t>datosFactura-plazoFac</w:t>
+      </w:r>
+      <w:proofErr w:type="spellEnd"/>
+      <w:r>
+        <w:rPr>
+          <w:rFonts w:ascii="Arial" w:hAnsi="Arial"/>
+          <w:sz w:val="22"/>
+          <w:szCs w:val="22"/>
+        </w:rPr>
+        <w:t>}</w:t>
+      </w:r>
+      <w:r>
+        <w:rPr>
+          <w:rFonts w:ascii="Arial" w:hAnsi="Arial"/>
+          <w:b/>
+          <w:bCs/>
+          <w:color w:val="FF0000"/>
+          <w:sz w:val="22"/>
+          <w:szCs w:val="22"/>
+        </w:rPr>
+        <w:t>{</w:t>
+      </w:r>
+      <w:proofErr w:type="spellStart"/>
+      <w:r>
+        <w:rPr>
+          <w:rFonts w:ascii="Arial" w:hAnsi="Arial"/>
+          <w:b/>
+          <w:bCs/>
+          <w:color w:val="FF0000"/>
+          <w:sz w:val="22"/>
+          <w:szCs w:val="22"/>
+        </w:rPr>
+        <w:t>datosFactura-plazoFacRRR</w:t>
+      </w:r>
+      <w:proofErr w:type="spellEnd"/>
+      <w:r>
+        <w:rPr>
+          <w:rFonts w:ascii="Arial" w:hAnsi="Arial"/>
+          <w:b/>
+          <w:bCs/>
+          <w:color w:val="FF0000"/>
+          <w:sz w:val="22"/>
+          <w:szCs w:val="22"/>
+        </w:rPr>
+        <w:t>}</w:t>
+      </w:r>
+      <w:r>
+        <w:rPr>
+          <w:rFonts w:ascii="Arial" w:hAnsi="Arial"/>
+          <w:color w:val="FF0000"/>
+          <w:sz w:val="22"/>
+          <w:szCs w:val="22"/>
+        </w:rPr>
+        <w:t xml:space="preserve"> </w:t>
+      </w:r>
+      <w:r>
+        <w:rPr>
+          <w:rFonts w:ascii="Arial" w:hAnsi="Arial"/>
+          <w:sz w:val="22"/>
+          <w:szCs w:val="22"/>
+        </w:rPr>
+        <w:t xml:space="preserve">días de la </w:t>
+      </w:r>
+      <w:r>
+        <w:rPr>
+          <w:rFonts w:ascii="Arial" w:hAnsi="Arial"/>
+          <w:sz w:val="22"/>
+          <w:szCs w:val="22"/>
+        </w:rPr>
+        <w:t>{</w:t>
+      </w:r>
+      <w:proofErr w:type="spellStart"/>
+      <w:r>
+        <w:rPr>
+          <w:rFonts w:ascii="Arial" w:hAnsi="Arial"/>
+          <w:sz w:val="22"/>
+          <w:szCs w:val="22"/>
+        </w:rPr>
+        <w:t>textoFechaTipado</w:t>
+      </w:r>
+      <w:proofErr w:type="spellEnd"/>
+      <w:r>
+        <w:rPr>
+          <w:rFonts w:ascii="Arial" w:hAnsi="Arial"/>
+          <w:sz w:val="22"/>
+          <w:szCs w:val="22"/>
+        </w:rPr>
+        <w:t>}</w:t>
+      </w:r>
+      <w:r>
+        <w:rPr>
+          <w:rFonts w:ascii="Arial" w:hAnsi="Arial"/>
+          <w:b/>
+          <w:bCs/>
+          <w:color w:val="FF0000"/>
+          <w:sz w:val="22"/>
+          <w:szCs w:val="22"/>
+        </w:rPr>
+        <w:t>{</w:t>
+      </w:r>
+      <w:proofErr w:type="spellStart"/>
+      <w:r>
+        <w:rPr>
+          <w:rFonts w:ascii="Arial" w:hAnsi="Arial"/>
+          <w:b/>
+          <w:bCs/>
+          <w:color w:val="FF0000"/>
+          <w:sz w:val="22"/>
+          <w:szCs w:val="22"/>
+        </w:rPr>
+        <w:t>textoFechaTipadoRRR</w:t>
+      </w:r>
+      <w:proofErr w:type="spellEnd"/>
+      <w:r>
+        <w:rPr>
+          <w:rFonts w:ascii="Arial" w:hAnsi="Arial"/>
+          <w:b/>
+          <w:bCs/>
+          <w:color w:val="FF0000"/>
+          <w:sz w:val="22"/>
+          <w:szCs w:val="22"/>
+        </w:rPr>
+        <w:t>}</w:t>
+      </w:r>
+      <w:r>
+        <w:rPr>
+          <w:rFonts w:ascii="Arial" w:hAnsi="Arial"/>
+          <w:sz w:val="22"/>
+          <w:szCs w:val="22"/>
+        </w:rPr>
+        <w:t xml:space="preserve"> </w:t>
+      </w:r>
+      <w:r>
+        <w:rPr>
+          <w:rFonts w:ascii="Arial" w:hAnsi="Arial"/>
+          <w:sz w:val="22"/>
+          <w:szCs w:val="22"/>
+        </w:rPr>
+        <w:t>se evidencia que el importador todavía se encuentra dentro del plazo para realizar la transferencia por el pago de las mercancías; en tal sentido, corresponde la devolución solicitada por {</w:t>
+      </w:r>
+      <w:proofErr w:type="spellStart"/>
+      <w:r>
+        <w:rPr>
+          <w:rFonts w:ascii="Arial" w:hAnsi="Arial"/>
+          <w:sz w:val="22"/>
+          <w:szCs w:val="22"/>
+        </w:rPr>
+        <w:t>fromDam-nombreEmpresa</w:t>
+      </w:r>
+      <w:proofErr w:type="spellEnd"/>
+      <w:r>
+        <w:rPr>
+          <w:rFonts w:ascii="Arial" w:hAnsi="Arial"/>
+          <w:sz w:val="22"/>
+          <w:szCs w:val="22"/>
+        </w:rPr>
+        <w:t>}</w:t>
+      </w:r>
+      <w:r>
+        <w:rPr>
+          <w:rFonts w:ascii="Arial" w:hAnsi="Arial"/>
+          <w:b/>
+          <w:bCs/>
+          <w:color w:val="FF0000"/>
+          <w:sz w:val="22"/>
+          <w:szCs w:val="22"/>
+        </w:rPr>
+        <w:t>{</w:t>
+      </w:r>
+      <w:proofErr w:type="spellStart"/>
+      <w:r>
+        <w:rPr>
+          <w:rFonts w:ascii="Arial" w:hAnsi="Arial"/>
+          <w:b/>
+          <w:bCs/>
+          <w:color w:val="FF0000"/>
+          <w:sz w:val="22"/>
+          <w:szCs w:val="22"/>
+        </w:rPr>
+        <w:t>fromDam-nombreEmpresaRRR</w:t>
+      </w:r>
+      <w:proofErr w:type="spellEnd"/>
+      <w:r>
+        <w:rPr>
+          <w:rFonts w:ascii="Arial" w:hAnsi="Arial"/>
+          <w:b/>
+          <w:bCs/>
+          <w:color w:val="FF0000"/>
+          <w:sz w:val="22"/>
+          <w:szCs w:val="22"/>
+        </w:rPr>
+        <w:t>}</w:t>
+      </w:r>
+      <w:r>
+        <w:rPr>
+          <w:rFonts w:ascii="Arial" w:hAnsi="Arial"/>
+          <w:sz w:val="22"/>
+          <w:szCs w:val="22"/>
+        </w:rPr>
+        <w:t>. identificada con RUC n.º {</w:t>
+      </w:r>
+      <w:proofErr w:type="spellStart"/>
+      <w:r>
+        <w:rPr>
+          <w:rFonts w:ascii="Arial" w:hAnsi="Arial"/>
+          <w:sz w:val="22"/>
+          <w:szCs w:val="22"/>
+        </w:rPr>
+        <w:t>fromDam</w:t>
+      </w:r>
+      <w:proofErr w:type="spellEnd"/>
+      <w:r>
+        <w:rPr>
+          <w:rFonts w:ascii="Arial" w:hAnsi="Arial"/>
+          <w:sz w:val="22"/>
+          <w:szCs w:val="22"/>
+        </w:rPr>
+        <w:t>-ruc} al amparo de la Ley n.º 27037, al no configurar la exclusión establecida en el artículo 8° de la Mencionada</w:t>
+      </w:r>
+      <w:r>
+        <w:rPr>
+          <w:rFonts w:ascii="Arial" w:hAnsi="Arial"/>
+          <w:sz w:val="22"/>
+          <w:szCs w:val="22"/>
+        </w:rPr>
+        <w:t xml:space="preserve"> Ley;</w:t>
+      </w:r>
+    </w:p>
+    <w:p>
+      <w:pPr>
+        <w:spacing w:before="120" w:after="0" w:line="259" w:lineRule="auto"/>
+        <w:jc w:val="both"/>
+        <w:rPr>
+          <w:rFonts w:ascii="Arial" w:hAnsi="Arial" w:cs="Arial"/>
+          <w:sz w:val="22"/>
+          <w:szCs w:val="22"/>
+        </w:rPr>
+      </w:pPr>
+    </w:p>
+    <w:p>
+      <w:pPr>
+        <w:spacing w:before="120" w:after="0" w:line="259" w:lineRule="auto"/>
+        <w:jc w:val="both"/>
+        <w:rPr>
+          <w:rFonts w:ascii="Arial" w:hAnsi="Arial" w:cs="Arial"/>
+          <w:sz w:val="22"/>
+          <w:szCs w:val="22"/>
+        </w:rPr>
+      </w:pPr>
+      <w:r>
+        <w:rPr>
+          <w:rFonts w:ascii="Arial" w:hAnsi="Arial" w:cs="Arial"/>
+          <w:sz w:val="22"/>
+          <w:szCs w:val="22"/>
+        </w:rPr>
+        <w:t>{/</w:t>
+      </w:r>
+      <w:proofErr w:type="spellStart"/>
+      <w:r>
+        <w:rPr>
+          <w:rFonts w:ascii="Arial" w:hAnsi="Arial" w:cs="Arial"/>
+          <w:sz w:val="22"/>
+          <w:szCs w:val="22"/>
+        </w:rPr>
+        <w:t>estadoPagoFacturaTipoPlazo</w:t>
+      </w:r>
+      <w:proofErr w:type="spellEnd"/>
+      <w:r>
+        <w:rPr>
+          <w:rFonts w:ascii="Arial" w:hAnsi="Arial" w:cs="Arial"/>
+          <w:sz w:val="22"/>
+          <w:szCs w:val="22"/>
+        </w:rPr>
+        <w:t>}</w:t>
       </w:r>
     </w:p>
     <w:p>
@@ -8895,21 +9411,96 @@
         <w:rPr>
           <w:rFonts w:ascii="Arial" w:hAnsi="Arial" w:cs="Arial"/>
         </w:rPr>
-        <w:t>{/</w:t>
-      </w:r>
-      <w:proofErr w:type="spellStart"/>
-      <w:r>
-        <w:rPr>
-          <w:rFonts w:ascii="Arial" w:hAnsi="Arial" w:cs="Arial"/>
-        </w:rPr>
-        <w:t>estadoPagadoFactura</w:t>
-      </w:r>
-      <w:proofErr w:type="spellEnd"/>
+        <w:t>{#</w:t>
+      </w:r>
+      <w:r>
+        <w:rPr>
+          <w:rFonts w:ascii="Arial" w:hAnsi="Arial" w:cs="Arial"/>
+        </w:rPr>
+        <w:t>estadoPago</w:t>
+      </w:r>
       <w:r>
         <w:rPr>
           <w:rFonts w:ascii="Arial" w:hAnsi="Arial" w:cs="Arial"/>
         </w:rPr>
         <w:t>}</w:t>
+      </w:r>
+    </w:p>
+    <w:p>
+      <w:pPr>
+        <w:pStyle w:val="Textoindependiente"/>
+        <w:spacing w:after="0" w:line="240" w:lineRule="auto"/>
+        <w:ind w:firstLine="3686"/>
+        <w:jc w:val="both"/>
+        <w:rPr>
+          <w:rFonts w:ascii="Arial" w:hAnsi="Arial" w:cs="Arial"/>
+        </w:rPr>
+      </w:pPr>
+      <w:r>
+        <w:rPr>
+          <w:rFonts w:ascii="Arial" w:hAnsi="Arial"/>
+        </w:rPr>
+        <w:t xml:space="preserve">Que, </w:t>
+      </w:r>
+      <w:r>
+        <w:rPr>
+          <w:rFonts w:ascii="Arial" w:hAnsi="Arial"/>
+        </w:rPr>
+        <w:t xml:space="preserve">La Ley </w:t>
+      </w:r>
+      <w:r>
+        <w:rPr>
+          <w:rFonts w:ascii="Arial" w:hAnsi="Arial"/>
+        </w:rPr>
+        <w:t>n</w:t>
+      </w:r>
+      <w:r>
+        <w:rPr>
+          <w:rFonts w:ascii="Arial" w:hAnsi="Arial"/>
+        </w:rPr>
+        <w:t>.º 28194 “Ley para la Lucha contra la Evasión y para la Formalización de la Economía” establece en su artículo 3-A la obligatoriedad del uso de medios de pago en la compraventa internacional de mercancías, en tal sentido, se procedió a evaluar la factura remitida por el administrado y los medios de pago adjuntado</w:t>
+      </w:r>
+      <w:r>
+        <w:rPr>
+          <w:rFonts w:ascii="Arial" w:hAnsi="Arial"/>
+        </w:rPr>
+        <w:t>s</w:t>
+      </w:r>
+      <w:r>
+        <w:rPr>
+          <w:rFonts w:ascii="Arial" w:hAnsi="Arial"/>
+        </w:rPr>
+        <w:t>, por lo cual s</w:t>
+      </w:r>
+      <w:r>
+        <w:rPr>
+          <w:rFonts w:ascii="Arial" w:hAnsi="Arial"/>
+        </w:rPr>
+        <w:t>í</w:t>
+      </w:r>
+      <w:r>
+        <w:rPr>
+          <w:rFonts w:ascii="Arial" w:hAnsi="Arial"/>
+        </w:rPr>
+        <w:t xml:space="preserve"> acredit</w:t>
+      </w:r>
+      <w:r>
+        <w:rPr>
+          <w:rFonts w:ascii="Arial" w:hAnsi="Arial"/>
+        </w:rPr>
+        <w:t>ó</w:t>
+      </w:r>
+      <w:r>
+        <w:rPr>
+          <w:rFonts w:ascii="Arial" w:hAnsi="Arial"/>
+        </w:rPr>
+        <w:t xml:space="preserve"> los medios de pago correspondiente</w:t>
+      </w:r>
+      <w:r>
+        <w:rPr>
+          <w:rFonts w:ascii="Arial" w:hAnsi="Arial"/>
+        </w:rPr>
+        <w:t xml:space="preserve">; </w:t>
       </w:r>
     </w:p>
     <w:p>
@@ -8921,6 +9512,36 @@
           <w:rFonts w:ascii="Arial" w:hAnsi="Arial" w:cs="Arial"/>
         </w:rPr>
       </w:pPr>
+      <w:r>
+        <w:rPr>
+          <w:rFonts w:ascii="Arial" w:hAnsi="Arial" w:cs="Arial"/>
+        </w:rPr>
+        <w:t>{/</w:t>
+      </w:r>
+      <w:proofErr w:type="spellStart"/>
+      <w:r>
+        <w:rPr>
+          <w:rFonts w:ascii="Arial" w:hAnsi="Arial" w:cs="Arial"/>
+        </w:rPr>
+        <w:t>estadoPago</w:t>
+      </w:r>
+      <w:proofErr w:type="spellEnd"/>
+      <w:r>
+        <w:rPr>
+          <w:rFonts w:ascii="Arial" w:hAnsi="Arial" w:cs="Arial"/>
+        </w:rPr>
+        <w:t>}</w:t>
+      </w:r>
+    </w:p>
+    <w:p>
+      <w:pPr>
+        <w:pStyle w:val="Textoindependiente"/>
+        <w:spacing w:after="0" w:line="240" w:lineRule="auto"/>
+        <w:jc w:val="both"/>
+        <w:rPr>
+          <w:rFonts w:ascii="Arial" w:hAnsi="Arial" w:cs="Arial"/>
+        </w:rPr>
+      </w:pPr>
     </w:p>
     <w:p>
       <w:pPr>
@@ -8932,7 +9553,7 @@
           <w:lang w:eastAsia="en-US"/>
         </w:rPr>
       </w:pPr>
-      <w:bookmarkStart w:id="2" w:name="_Hlk207100890"/>
+      <w:bookmarkStart w:id="3" w:name="_Hlk207100890"/>
       <w:r>
         <w:rPr>
           <w:rFonts w:ascii="Arial" w:hAnsi="Arial" w:cs="Arial"/>
@@ -9103,7 +9724,7 @@
         </w:rPr>
         <w:t>.</w:t>
       </w:r>
-      <w:bookmarkEnd w:id="2"/>
+      <w:bookmarkEnd w:id="3"/>
     </w:p>
     <w:p>
       <w:pPr>
@@ -9276,7 +9897,16 @@
           <w:sz w:val="22"/>
           <w:szCs w:val="22"/>
         </w:rPr>
-        <w:t>fromDam-numeroDam</w:t>
+        <w:t>fromDam-</w:t>
+      </w:r>
+      <w:proofErr w:type="gramStart"/>
+      <w:r>
+        <w:rPr>
+          <w:rFonts w:ascii="Arial" w:hAnsi="Arial" w:cs="Arial"/>
+          <w:sz w:val="22"/>
+          <w:szCs w:val="22"/>
+        </w:rPr>
+        <w:t>numeroDam</w:t>
       </w:r>
       <w:proofErr w:type="spellEnd"/>
       <w:r>
@@ -9299,6 +9929,7 @@
         <w:t>{</w:t>
       </w:r>
       <w:proofErr w:type="spellStart"/>
+      <w:proofErr w:type="gramEnd"/>
       <w:r>
         <w:rPr>
           <w:rFonts w:ascii="Arial" w:hAnsi="Arial" w:cs="Arial"/>
@@ -9428,7 +10059,16 @@
           <w:sz w:val="22"/>
           <w:szCs w:val="22"/>
         </w:rPr>
-        <w:t>fromDam-nombreEmpresa</w:t>
+        <w:t>fromDam-</w:t>
+      </w:r>
+      <w:proofErr w:type="gramStart"/>
+      <w:r>
+        <w:rPr>
+          <w:rFonts w:ascii="Arial" w:hAnsi="Arial" w:cs="Arial"/>
+          <w:sz w:val="22"/>
+          <w:szCs w:val="22"/>
+        </w:rPr>
+        <w:t>nombreEmpresa</w:t>
       </w:r>
       <w:proofErr w:type="spellEnd"/>
       <w:r>
@@ -9451,6 +10091,7 @@
         <w:t>{</w:t>
       </w:r>
       <w:proofErr w:type="spellStart"/>
+      <w:proofErr w:type="gramEnd"/>
       <w:r>
         <w:rPr>
           <w:rFonts w:ascii="Arial" w:hAnsi="Arial" w:cs="Arial"/>
@@ -9735,7 +10376,16 @@
           <w:sz w:val="22"/>
           <w:szCs w:val="22"/>
         </w:rPr>
-        <w:t>fromDam-numeroDam</w:t>
+        <w:t>fromDam-</w:t>
+      </w:r>
+      <w:proofErr w:type="gramStart"/>
+      <w:r>
+        <w:rPr>
+          <w:rFonts w:ascii="Arial" w:hAnsi="Arial" w:cs="Arial"/>
+          <w:sz w:val="22"/>
+          <w:szCs w:val="22"/>
+        </w:rPr>
+        <w:t>numeroDam</w:t>
       </w:r>
       <w:proofErr w:type="spellEnd"/>
       <w:r>
@@ -9758,6 +10408,7 @@
         <w:t>{</w:t>
       </w:r>
       <w:proofErr w:type="spellStart"/>
+      <w:proofErr w:type="gramEnd"/>
       <w:r>
         <w:rPr>
           <w:rFonts w:ascii="Arial" w:hAnsi="Arial" w:cs="Arial"/>
@@ -10075,16 +10726,7 @@
           <w:sz w:val="22"/>
           <w:szCs w:val="22"/>
         </w:rPr>
-        <w:t xml:space="preserve"> cargo a la “Sub </w:t>
-      </w:r>
-      <w:r>
-        <w:rPr>
-          <w:rFonts w:ascii="Arial" w:hAnsi="Arial" w:cs="Arial"/>
-          <w:sz w:val="22"/>
-          <w:szCs w:val="22"/>
-        </w:rPr>
-        <w:lastRenderedPageBreak/>
-        <w:t xml:space="preserve">Cuenta Especial Tesoro Público Ley </w:t>
+        <w:t xml:space="preserve"> cargo a la “Sub Cuenta Especial Tesoro Público Ley </w:t>
       </w:r>
       <w:r>
         <w:rPr>
@@ -10465,7 +11107,16 @@
           <w:sz w:val="22"/>
           <w:szCs w:val="22"/>
         </w:rPr>
-        <w:t>fromDam-numeroDam</w:t>
+        <w:t>fromDam-</w:t>
+      </w:r>
+      <w:proofErr w:type="gramStart"/>
+      <w:r>
+        <w:rPr>
+          <w:rFonts w:ascii="Arial" w:hAnsi="Arial" w:cs="Arial"/>
+          <w:sz w:val="22"/>
+          <w:szCs w:val="22"/>
+        </w:rPr>
+        <w:t>numeroDam</w:t>
       </w:r>
       <w:proofErr w:type="spellEnd"/>
       <w:r>
@@ -10488,6 +11139,7 @@
         <w:t>{</w:t>
       </w:r>
       <w:proofErr w:type="spellStart"/>
+      <w:proofErr w:type="gramEnd"/>
       <w:r>
         <w:rPr>
           <w:rFonts w:ascii="Arial" w:hAnsi="Arial" w:cs="Arial"/>
@@ -10671,7 +11323,16 @@
           <w:sz w:val="22"/>
           <w:szCs w:val="22"/>
         </w:rPr>
-        <w:t>fromDam-nombreEmpresa</w:t>
+        <w:t>fromDam-</w:t>
+      </w:r>
+      <w:proofErr w:type="gramStart"/>
+      <w:r>
+        <w:rPr>
+          <w:rFonts w:ascii="Arial" w:hAnsi="Arial" w:cs="Arial"/>
+          <w:sz w:val="22"/>
+          <w:szCs w:val="22"/>
+        </w:rPr>
+        <w:t>nombreEmpresa</w:t>
       </w:r>
       <w:proofErr w:type="spellEnd"/>
       <w:r>
@@ -10694,6 +11355,7 @@
         <w:t>{</w:t>
       </w:r>
       <w:proofErr w:type="spellStart"/>
+      <w:proofErr w:type="gramEnd"/>
       <w:r>
         <w:rPr>
           <w:rFonts w:ascii="Arial" w:hAnsi="Arial" w:cs="Arial"/>
@@ -10984,6 +11646,7 @@
           <w:b/>
           <w:u w:val="single"/>
         </w:rPr>
+        <w:lastRenderedPageBreak/>
         <w:t>Distribución</w:t>
       </w:r>
       <w:r>

</xml_diff>